<commit_message>
Add subscription tracking & financial widgets
Introduce comprehensive subscription management features to the Budget page:

- New components:
  • CalendrierEcheances: Monthly calendar showing subscription payment dates
  • SubscriptionCleaner: Manage subscriptions with add/remove/mark-for-cancellation
  • WidgetRestantAVivre: Display remaining monthly budget and daily allowance
  • WidgetWhatIf: Financial projection simulator with compound interest

- New utilities:
  • useAbonnements hook: Manage subscription data from Supabase
  • budgetCalculator: Functions for remaining balance and investment projections

- Budget.jsx refactored:
  • Integrated new widget grid layout
  • Added subscription-aware budget calculations
  • Improved code organization with section comments
</commit_message>
<xml_diff>
--- a/details technique/remarque de choses a ameliorer.docx
+++ b/details technique/remarque de choses a ameliorer.docx
@@ -4,58 +4,56 @@
   <w:body>
     <w:p>
       <w:r>
-        <w:t xml:space="preserve">Les immports ne sont pas lier au budget et a vrai dépenses et revenu et lorsque que l’on rentre des cathegorie revenu bas ca doit être des revenu donc des plus et pas moins. Puis ces donner doivent être prises en compte dans tous les graphique et info usr mes depences et revenu. </w:t>
+        <w:t xml:space="preserve">On ne voit pas dans </w:t>
       </w:r>
+      <w:proofErr w:type="spellStart"/>
+      <w:r>
+        <w:t>linterfaces</w:t>
+      </w:r>
+      <w:proofErr w:type="spellEnd"/>
+      <w:r>
+        <w:t xml:space="preserve"> les </w:t>
+      </w:r>
+      <w:proofErr w:type="spellStart"/>
+      <w:r>
+        <w:t>differente</w:t>
+      </w:r>
+      <w:proofErr w:type="spellEnd"/>
+      <w:r>
+        <w:t xml:space="preserve"> </w:t>
+      </w:r>
+      <w:proofErr w:type="spellStart"/>
+      <w:r>
+        <w:t>monaie</w:t>
+      </w:r>
+      <w:proofErr w:type="spellEnd"/>
+      <w:r>
+        <w:t xml:space="preserve"> dans </w:t>
+      </w:r>
+      <w:proofErr w:type="spellStart"/>
+      <w:r>
+        <w:t>parametre</w:t>
+      </w:r>
+      <w:proofErr w:type="spellEnd"/>
       <w:r>
         <w:br/>
-        <w:t xml:space="preserve"> la gestion des cathegorie est a revoir car lorsque l’on en supprime elle reaparaisse car elles sont def de base mais elles sont nul alors je veux pouvoir décider. Et lorsque je mets revenu ca veut dire rentrer dargent et quand je mets depence ca veut dire moins dargent.</w:t>
+        <w:t xml:space="preserve">de plus la typographie n’est pas </w:t>
       </w:r>
+      <w:proofErr w:type="spellStart"/>
       <w:r>
-        <w:br/>
-        <w:t xml:space="preserve"> le menu de def de budget dans longlet budget ne fonstionne pas bien car il est pas deroulant par cathegorie donc on a pas accet a tous car lecran est trop petit sinon et de plus on a pas les bouton de validation et tous ca. </w:t>
+        <w:t>msies</w:t>
       </w:r>
+      <w:proofErr w:type="spellEnd"/>
       <w:r>
-        <w:br/>
-        <w:t xml:space="preserve">J’ai l’impression que mes comptes ne sont pas </w:t>
+        <w:t xml:space="preserve"> en place partout, </w:t>
       </w:r>
+      <w:proofErr w:type="spellStart"/>
       <w:r>
-        <w:t>relier</w:t>
+        <w:t>longlet</w:t>
       </w:r>
+      <w:proofErr w:type="spellEnd"/>
       <w:r>
-        <w:t xml:space="preserve"> a mes dépenses car dans </w:t>
-      </w:r>
-      <w:r>
-        <w:t>l’import</w:t>
-      </w:r>
-      <w:r>
-        <w:t xml:space="preserve"> on ne dit pas de quelle compte ca vient et les dépenses </w:t>
-      </w:r>
-      <w:r>
-        <w:t>enregistrer</w:t>
-      </w:r>
-      <w:r>
-        <w:t xml:space="preserve"> ne sont pas débiter de mes comptes enregistrer dans </w:t>
-      </w:r>
-      <w:r>
-        <w:t xml:space="preserve">mon patrimoine. </w:t>
-      </w:r>
-      <w:r>
-        <w:br/>
-        <w:t>mon cash flot de mon immobileir n’est pas pris en comptes sur mes dépenses et revenu dans budget et pareil pour mes revenu de dividende et de vente de crypto et d’action. Mais les depences et revenu mis automatiquement depuis lapp doivent être vérifier par rapport a ceux importer pour éviter les doublons donc les valeurs doivent être virfier si certaines sont similaire et dans les même cathegorie les enlever mais en demandant quand même a lutilisateurs.</w:t>
-      </w:r>
-      <w:r>
-        <w:br/>
-      </w:r>
-      <w:r>
-        <w:br/>
-        <w:t xml:space="preserve">faire en sorte que lors des import de relever bancaire soit analyser par rapport au frais et que les frais soit classer dans leur cathegorie. </w:t>
-      </w:r>
-      <w:r>
-        <w:t xml:space="preserve">Genre si je vends ou ahctes des actions bas le prix d evente doit être comaprer au prix réel reçue et en déduire les frais et ainsis de suiste pour toute les dépenses et revenu et tenir comptes de frais dans limmobilier aussi car pour l’instant ils sont pas pris en compte. </w:t>
-      </w:r>
-      <w:r>
-        <w:br/>
-        <w:t>et faire attention que les dettess soit bien leir dans les budget par rapport a ce qu’on a rentrer et les decter aussi dans limport depuis pdf et CSV</w:t>
+        <w:t xml:space="preserve"> investissement semble avoir été oublier.</w:t>
       </w:r>
     </w:p>
     <w:sectPr>

</xml_diff>

<commit_message>
Add dividend panels & Fondora scaffold
Introduce dividend UI and estimation features: refactor DividendesCard to include DividendesGraphiques and EstimationDividendesPanel; add components DividendesGraphiques.jsx and EstimationDividendesPanel.jsx; add hook useEstimationDividendes and utils/estimationDividendes for dividend estimations. Update Investir.jsx to remove old transaction modals. Add a self-contained Fondora frontend scaffold (vite, package.json, package-lock, vite.config, vercel.json, README) and legal/privacy docs plus a catalogue population script (remplir_catalogue.py). Note: remplir_catalogue.py currently contains a hardcoded SUPABASE_KEY placeholder—remove or secure real secrets before committing or running.
</commit_message>
<xml_diff>
--- a/details technique/remarque de choses a ameliorer.docx
+++ b/details technique/remarque de choses a ameliorer.docx
@@ -54,6 +54,231 @@
       <w:proofErr w:type="spellEnd"/>
       <w:r>
         <w:t xml:space="preserve"> investissement semble avoir été oublier.</w:t>
+      </w:r>
+      <w:r>
+        <w:t xml:space="preserve"> Les </w:t>
+      </w:r>
+      <w:proofErr w:type="spellStart"/>
+      <w:r>
+        <w:t>ecritrures</w:t>
+      </w:r>
+      <w:proofErr w:type="spellEnd"/>
+      <w:r>
+        <w:t xml:space="preserve"> blanche sur blanc dans les menue </w:t>
+      </w:r>
+      <w:proofErr w:type="spellStart"/>
+      <w:r>
+        <w:t>deroulant</w:t>
+      </w:r>
+      <w:proofErr w:type="spellEnd"/>
+      <w:r>
+        <w:t xml:space="preserve"> font qu’on </w:t>
+      </w:r>
+      <w:proofErr w:type="gramStart"/>
+      <w:r>
+        <w:t>ne  voit</w:t>
+      </w:r>
+      <w:proofErr w:type="gramEnd"/>
+      <w:r>
+        <w:t xml:space="preserve"> rien.</w:t>
+      </w:r>
+    </w:p>
+    <w:p>
+      <w:r>
+        <w:br/>
+        <w:t xml:space="preserve">Dans </w:t>
+      </w:r>
+      <w:proofErr w:type="spellStart"/>
+      <w:r>
+        <w:t>longlet</w:t>
+      </w:r>
+      <w:proofErr w:type="spellEnd"/>
+      <w:r>
+        <w:t xml:space="preserve"> budget il faudrait que tous les graphiques et panneau de </w:t>
+      </w:r>
+      <w:proofErr w:type="spellStart"/>
+      <w:r>
+        <w:t>linterfaces</w:t>
+      </w:r>
+      <w:proofErr w:type="spellEnd"/>
+      <w:r>
+        <w:t xml:space="preserve"> soit </w:t>
+      </w:r>
+      <w:proofErr w:type="spellStart"/>
+      <w:r>
+        <w:t>optionable</w:t>
+      </w:r>
+      <w:proofErr w:type="spellEnd"/>
+      <w:r>
+        <w:t xml:space="preserve"> et qu’on </w:t>
+      </w:r>
+      <w:proofErr w:type="spellStart"/>
+      <w:r>
+        <w:t>choissis</w:t>
+      </w:r>
+      <w:proofErr w:type="spellEnd"/>
+      <w:r>
+        <w:t xml:space="preserve"> </w:t>
+      </w:r>
+      <w:proofErr w:type="gramStart"/>
+      <w:r>
+        <w:t>les quelles</w:t>
+      </w:r>
+      <w:proofErr w:type="gramEnd"/>
+      <w:r>
+        <w:t xml:space="preserve"> mettre donc rajouter les choses qui ne le sont pas dans </w:t>
+      </w:r>
+      <w:proofErr w:type="spellStart"/>
+      <w:r>
+        <w:t>personlaiser</w:t>
+      </w:r>
+      <w:proofErr w:type="spellEnd"/>
+      <w:r>
+        <w:t xml:space="preserve"> les graphiques.</w:t>
+      </w:r>
+      <w:r>
+        <w:br/>
+        <w:t xml:space="preserve">on a un </w:t>
+      </w:r>
+      <w:proofErr w:type="spellStart"/>
+      <w:r>
+        <w:t>gaphiques</w:t>
+      </w:r>
+      <w:proofErr w:type="spellEnd"/>
+      <w:r>
+        <w:t xml:space="preserve">  et si </w:t>
+      </w:r>
+      <w:proofErr w:type="spellStart"/>
+      <w:r>
+        <w:t>jepargnais</w:t>
+      </w:r>
+      <w:proofErr w:type="spellEnd"/>
+      <w:r>
+        <w:t xml:space="preserve"> mais on peut rien régler dedans et il est pas relier a </w:t>
+      </w:r>
+      <w:proofErr w:type="spellStart"/>
+      <w:r>
+        <w:t>lobjectif</w:t>
+      </w:r>
+      <w:proofErr w:type="spellEnd"/>
+      <w:r>
+        <w:t xml:space="preserve"> </w:t>
+      </w:r>
+      <w:proofErr w:type="spellStart"/>
+      <w:r>
+        <w:t>deparnge</w:t>
+      </w:r>
+      <w:proofErr w:type="spellEnd"/>
+      <w:r>
+        <w:t xml:space="preserve"> il faut </w:t>
+      </w:r>
+      <w:proofErr w:type="spellStart"/>
+      <w:r>
+        <w:t>relger</w:t>
+      </w:r>
+      <w:proofErr w:type="spellEnd"/>
+      <w:r>
+        <w:t xml:space="preserve"> ca le </w:t>
+      </w:r>
+      <w:proofErr w:type="spellStart"/>
+      <w:r>
+        <w:t>graphiqeus</w:t>
+      </w:r>
+      <w:proofErr w:type="spellEnd"/>
+      <w:r>
+        <w:t xml:space="preserve"> restant a vivre n’a aucune donner il sert </w:t>
+      </w:r>
+      <w:proofErr w:type="spellStart"/>
+      <w:r>
+        <w:t>a</w:t>
+      </w:r>
+      <w:proofErr w:type="spellEnd"/>
+      <w:r>
+        <w:t xml:space="preserve"> </w:t>
+      </w:r>
+      <w:proofErr w:type="spellStart"/>
+      <w:r>
+        <w:t>iren</w:t>
+      </w:r>
+      <w:proofErr w:type="spellEnd"/>
+      <w:r>
+        <w:t xml:space="preserve"> il faut le </w:t>
+      </w:r>
+      <w:proofErr w:type="spellStart"/>
+      <w:r>
+        <w:t>releir</w:t>
+      </w:r>
+      <w:proofErr w:type="spellEnd"/>
+      <w:r>
+        <w:t xml:space="preserve"> au donner. </w:t>
+      </w:r>
+      <w:r>
+        <w:br/>
+      </w:r>
+      <w:proofErr w:type="gramStart"/>
+      <w:r>
+        <w:t>on</w:t>
+      </w:r>
+      <w:proofErr w:type="gramEnd"/>
+      <w:r>
+        <w:t xml:space="preserve"> ne peut pas supprimer une </w:t>
+      </w:r>
+      <w:proofErr w:type="spellStart"/>
+      <w:r>
+        <w:t>depense</w:t>
+      </w:r>
+      <w:proofErr w:type="spellEnd"/>
+      <w:r>
+        <w:t xml:space="preserve"> ou un </w:t>
+      </w:r>
+      <w:proofErr w:type="spellStart"/>
+      <w:r>
+        <w:t>revneu</w:t>
+      </w:r>
+      <w:proofErr w:type="spellEnd"/>
+      <w:r>
+        <w:t xml:space="preserve"> </w:t>
+      </w:r>
+      <w:proofErr w:type="spellStart"/>
+      <w:r>
+        <w:t>recurent</w:t>
+      </w:r>
+      <w:proofErr w:type="spellEnd"/>
+      <w:r>
+        <w:t xml:space="preserve"> ca beugue il faut que ca soit possible et que ces </w:t>
+      </w:r>
+      <w:proofErr w:type="spellStart"/>
+      <w:r>
+        <w:t>depens</w:t>
+      </w:r>
+      <w:proofErr w:type="spellEnd"/>
+      <w:r>
+        <w:t xml:space="preserve"> soit bien prises en comptes tous le temps dans </w:t>
+      </w:r>
+      <w:proofErr w:type="spellStart"/>
+      <w:r>
+        <w:t>otus</w:t>
+      </w:r>
+      <w:proofErr w:type="spellEnd"/>
+      <w:r>
+        <w:t xml:space="preserve"> les graphiques sur les dépenses et sur les comptes au quelle elles sont </w:t>
+      </w:r>
+      <w:proofErr w:type="spellStart"/>
+      <w:r>
+        <w:t>afilier</w:t>
+      </w:r>
+      <w:proofErr w:type="spellEnd"/>
+      <w:r>
+        <w:t xml:space="preserve"> mais il faut aussi que ces donner de dépenses soit valider ou non par les relever bancaire importer et que si elle sont valider il n’y ai pas de doublon. Si tu comprends pas poses moi des questions.</w:t>
+      </w:r>
+      <w:r>
+        <w:br/>
+      </w:r>
+      <w:r>
+        <w:br/>
+      </w:r>
+      <w:r>
+        <w:br/>
       </w:r>
     </w:p>
     <w:sectPr>
@@ -669,7 +894,6 @@
   <w:style w:type="character" w:default="1" w:styleId="Policepardfaut">
     <w:name w:val="Default Paragraph Font"/>
     <w:uiPriority w:val="1"/>
-    <w:semiHidden/>
     <w:unhideWhenUsed/>
   </w:style>
   <w:style w:type="table" w:default="1" w:styleId="TableauNormal">

</xml_diff>

<commit_message>
Standardize transaction payload field names
Rename transaction payload fields from `quantity` and `price` to `quantite` and `prix` for consistency with French naming convention used throughout the project. Remove unused `date` field from payload and fix code indentation and formatting.
</commit_message>
<xml_diff>
--- a/details technique/remarque de choses a ameliorer.docx
+++ b/details technique/remarque de choses a ameliorer.docx
@@ -4,272 +4,28 @@
   <w:body>
     <w:p>
       <w:r>
-        <w:t xml:space="preserve">On ne voit pas dans </w:t>
+        <w:t>On ne voit pas dans linterfaces les differente monaie dans parametre</w:t>
       </w:r>
-      <w:proofErr w:type="spellStart"/>
-      <w:r>
-        <w:t>linterfaces</w:t>
-      </w:r>
-      <w:proofErr w:type="spellEnd"/>
-      <w:r>
-        <w:t xml:space="preserve"> les </w:t>
-      </w:r>
-      <w:proofErr w:type="spellStart"/>
-      <w:r>
-        <w:t>differente</w:t>
-      </w:r>
-      <w:proofErr w:type="spellEnd"/>
-      <w:r>
-        <w:t xml:space="preserve"> </w:t>
-      </w:r>
-      <w:proofErr w:type="spellStart"/>
-      <w:r>
-        <w:t>monaie</w:t>
-      </w:r>
-      <w:proofErr w:type="spellEnd"/>
-      <w:r>
-        <w:t xml:space="preserve"> dans </w:t>
-      </w:r>
-      <w:proofErr w:type="spellStart"/>
-      <w:r>
-        <w:t>parametre</w:t>
-      </w:r>
-      <w:proofErr w:type="spellEnd"/>
       <w:r>
         <w:br/>
-        <w:t xml:space="preserve">de plus la typographie n’est pas </w:t>
-      </w:r>
-      <w:proofErr w:type="spellStart"/>
-      <w:r>
-        <w:t>msies</w:t>
-      </w:r>
-      <w:proofErr w:type="spellEnd"/>
-      <w:r>
-        <w:t xml:space="preserve"> en place partout, </w:t>
-      </w:r>
-      <w:proofErr w:type="spellStart"/>
-      <w:r>
-        <w:t>longlet</w:t>
-      </w:r>
-      <w:proofErr w:type="spellEnd"/>
-      <w:r>
-        <w:t xml:space="preserve"> investissement semble avoir été oublier.</w:t>
+        <w:t>de plus la typographie n’est pas msies en place partout, longlet investissement semble avoir été oublier.</w:t>
       </w:r>
       <w:r>
-        <w:t xml:space="preserve"> Les </w:t>
-      </w:r>
-      <w:proofErr w:type="spellStart"/>
-      <w:r>
-        <w:t>ecritrures</w:t>
-      </w:r>
-      <w:proofErr w:type="spellEnd"/>
-      <w:r>
-        <w:t xml:space="preserve"> blanche sur blanc dans les menue </w:t>
-      </w:r>
-      <w:proofErr w:type="spellStart"/>
-      <w:r>
-        <w:t>deroulant</w:t>
-      </w:r>
-      <w:proofErr w:type="spellEnd"/>
-      <w:r>
-        <w:t xml:space="preserve"> font qu’on </w:t>
-      </w:r>
-      <w:proofErr w:type="gramStart"/>
-      <w:r>
-        <w:t>ne  voit</w:t>
-      </w:r>
-      <w:proofErr w:type="gramEnd"/>
-      <w:r>
-        <w:t xml:space="preserve"> rien.</w:t>
+        <w:t xml:space="preserve"> Les ecritrures blanche sur blanc dans les menue deroulant font qu’on ne  voit rien.</w:t>
       </w:r>
     </w:p>
     <w:p>
       <w:r>
         <w:br/>
-        <w:t xml:space="preserve">Dans </w:t>
-      </w:r>
-      <w:proofErr w:type="spellStart"/>
-      <w:r>
-        <w:t>longlet</w:t>
-      </w:r>
-      <w:proofErr w:type="spellEnd"/>
-      <w:r>
-        <w:t xml:space="preserve"> budget il faudrait que tous les graphiques et panneau de </w:t>
-      </w:r>
-      <w:proofErr w:type="spellStart"/>
-      <w:r>
-        <w:t>linterfaces</w:t>
-      </w:r>
-      <w:proofErr w:type="spellEnd"/>
-      <w:r>
-        <w:t xml:space="preserve"> soit </w:t>
-      </w:r>
-      <w:proofErr w:type="spellStart"/>
-      <w:r>
-        <w:t>optionable</w:t>
-      </w:r>
-      <w:proofErr w:type="spellEnd"/>
-      <w:r>
-        <w:t xml:space="preserve"> et qu’on </w:t>
-      </w:r>
-      <w:proofErr w:type="spellStart"/>
-      <w:r>
-        <w:t>choissis</w:t>
-      </w:r>
-      <w:proofErr w:type="spellEnd"/>
-      <w:r>
-        <w:t xml:space="preserve"> </w:t>
-      </w:r>
-      <w:proofErr w:type="gramStart"/>
-      <w:r>
-        <w:t>les quelles</w:t>
-      </w:r>
-      <w:proofErr w:type="gramEnd"/>
-      <w:r>
-        <w:t xml:space="preserve"> mettre donc rajouter les choses qui ne le sont pas dans </w:t>
-      </w:r>
-      <w:proofErr w:type="spellStart"/>
-      <w:r>
-        <w:t>personlaiser</w:t>
-      </w:r>
-      <w:proofErr w:type="spellEnd"/>
-      <w:r>
-        <w:t xml:space="preserve"> les graphiques.</w:t>
+        <w:t>Dans longlet budget il faudrait que tous les graphiques et panneau de linterfaces soit optionable et qu’on choissis les quelles mettre donc rajouter les choses qui ne le sont pas dans personlaiser les graphiques.</w:t>
       </w:r>
       <w:r>
         <w:br/>
-        <w:t xml:space="preserve">on a un </w:t>
-      </w:r>
-      <w:proofErr w:type="spellStart"/>
-      <w:r>
-        <w:t>gaphiques</w:t>
-      </w:r>
-      <w:proofErr w:type="spellEnd"/>
-      <w:r>
-        <w:t xml:space="preserve">  et si </w:t>
-      </w:r>
-      <w:proofErr w:type="spellStart"/>
-      <w:r>
-        <w:t>jepargnais</w:t>
-      </w:r>
-      <w:proofErr w:type="spellEnd"/>
-      <w:r>
-        <w:t xml:space="preserve"> mais on peut rien régler dedans et il est pas relier a </w:t>
-      </w:r>
-      <w:proofErr w:type="spellStart"/>
-      <w:r>
-        <w:t>lobjectif</w:t>
-      </w:r>
-      <w:proofErr w:type="spellEnd"/>
-      <w:r>
-        <w:t xml:space="preserve"> </w:t>
-      </w:r>
-      <w:proofErr w:type="spellStart"/>
-      <w:r>
-        <w:t>deparnge</w:t>
-      </w:r>
-      <w:proofErr w:type="spellEnd"/>
-      <w:r>
-        <w:t xml:space="preserve"> il faut </w:t>
-      </w:r>
-      <w:proofErr w:type="spellStart"/>
-      <w:r>
-        <w:t>relger</w:t>
-      </w:r>
-      <w:proofErr w:type="spellEnd"/>
-      <w:r>
-        <w:t xml:space="preserve"> ca le </w:t>
-      </w:r>
-      <w:proofErr w:type="spellStart"/>
-      <w:r>
-        <w:t>graphiqeus</w:t>
-      </w:r>
-      <w:proofErr w:type="spellEnd"/>
-      <w:r>
-        <w:t xml:space="preserve"> restant a vivre n’a aucune donner il sert </w:t>
-      </w:r>
-      <w:proofErr w:type="spellStart"/>
-      <w:r>
-        <w:t>a</w:t>
-      </w:r>
-      <w:proofErr w:type="spellEnd"/>
-      <w:r>
-        <w:t xml:space="preserve"> </w:t>
-      </w:r>
-      <w:proofErr w:type="spellStart"/>
-      <w:r>
-        <w:t>iren</w:t>
-      </w:r>
-      <w:proofErr w:type="spellEnd"/>
-      <w:r>
-        <w:t xml:space="preserve"> il faut le </w:t>
-      </w:r>
-      <w:proofErr w:type="spellStart"/>
-      <w:r>
-        <w:t>releir</w:t>
-      </w:r>
-      <w:proofErr w:type="spellEnd"/>
-      <w:r>
-        <w:t xml:space="preserve"> au donner. </w:t>
+        <w:t xml:space="preserve">on a un gaphiques  et si jepargnais mais on peut rien régler dedans et il est pas relier a lobjectif deparnge il faut relger ca le graphiqeus restant a vivre n’a aucune donner il sert a iren il faut le releir au donner. </w:t>
       </w:r>
       <w:r>
         <w:br/>
-      </w:r>
-      <w:proofErr w:type="gramStart"/>
-      <w:r>
-        <w:t>on</w:t>
-      </w:r>
-      <w:proofErr w:type="gramEnd"/>
-      <w:r>
-        <w:t xml:space="preserve"> ne peut pas supprimer une </w:t>
-      </w:r>
-      <w:proofErr w:type="spellStart"/>
-      <w:r>
-        <w:t>depense</w:t>
-      </w:r>
-      <w:proofErr w:type="spellEnd"/>
-      <w:r>
-        <w:t xml:space="preserve"> ou un </w:t>
-      </w:r>
-      <w:proofErr w:type="spellStart"/>
-      <w:r>
-        <w:t>revneu</w:t>
-      </w:r>
-      <w:proofErr w:type="spellEnd"/>
-      <w:r>
-        <w:t xml:space="preserve"> </w:t>
-      </w:r>
-      <w:proofErr w:type="spellStart"/>
-      <w:r>
-        <w:t>recurent</w:t>
-      </w:r>
-      <w:proofErr w:type="spellEnd"/>
-      <w:r>
-        <w:t xml:space="preserve"> ca beugue il faut que ca soit possible et que ces </w:t>
-      </w:r>
-      <w:proofErr w:type="spellStart"/>
-      <w:r>
-        <w:t>depens</w:t>
-      </w:r>
-      <w:proofErr w:type="spellEnd"/>
-      <w:r>
-        <w:t xml:space="preserve"> soit bien prises en comptes tous le temps dans </w:t>
-      </w:r>
-      <w:proofErr w:type="spellStart"/>
-      <w:r>
-        <w:t>otus</w:t>
-      </w:r>
-      <w:proofErr w:type="spellEnd"/>
-      <w:r>
-        <w:t xml:space="preserve"> les graphiques sur les dépenses et sur les comptes au quelle elles sont </w:t>
-      </w:r>
-      <w:proofErr w:type="spellStart"/>
-      <w:r>
-        <w:t>afilier</w:t>
-      </w:r>
-      <w:proofErr w:type="spellEnd"/>
-      <w:r>
-        <w:t xml:space="preserve"> mais il faut aussi que ces donner de dépenses soit valider ou non par les relever bancaire importer et que si elle sont valider il n’y ai pas de doublon. Si tu comprends pas poses moi des questions.</w:t>
+        <w:t>on ne peut pas supprimer une depense ou un revneu recurent ca beugue il faut que ca soit possible et que ces depens soit bien prises en comptes tous le temps dans otus les graphiques sur les dépenses et sur les comptes au quelle elles sont afilier mais il faut aussi que ces donner de dépenses soit valider ou non par les relever bancaire importer et que si elle sont valider il n’y ai pas de doublon. Si tu comprends pas poses moi des questions.</w:t>
       </w:r>
       <w:r>
         <w:br/>
@@ -278,7 +34,76 @@
         <w:br/>
       </w:r>
       <w:r>
+        <w:lastRenderedPageBreak/>
         <w:br/>
+      </w:r>
+      <w:r>
+        <w:drawing>
+          <wp:anchor distT="0" distB="0" distL="114300" distR="114300" simplePos="0" relativeHeight="251658240" behindDoc="1" locked="0" layoutInCell="1" allowOverlap="1" wp14:anchorId="714170AA" wp14:editId="7290AF2B">
+            <wp:simplePos x="0" y="0"/>
+            <wp:positionH relativeFrom="column">
+              <wp:posOffset>1905</wp:posOffset>
+            </wp:positionH>
+            <wp:positionV relativeFrom="paragraph">
+              <wp:posOffset>186055</wp:posOffset>
+            </wp:positionV>
+            <wp:extent cx="5242560" cy="7139940"/>
+            <wp:effectExtent l="0" t="0" r="0" b="3810"/>
+            <wp:wrapTight wrapText="bothSides">
+              <wp:wrapPolygon edited="0">
+                <wp:start x="0" y="0"/>
+                <wp:lineTo x="0" y="21554"/>
+                <wp:lineTo x="21506" y="21554"/>
+                <wp:lineTo x="21506" y="0"/>
+                <wp:lineTo x="0" y="0"/>
+              </wp:wrapPolygon>
+            </wp:wrapTight>
+            <wp:docPr id="1" name="Image 1"/>
+            <wp:cNvGraphicFramePr>
+              <a:graphicFrameLocks xmlns:a="http://schemas.openxmlformats.org/drawingml/2006/main" noChangeAspect="1"/>
+            </wp:cNvGraphicFramePr>
+            <a:graphic xmlns:a="http://schemas.openxmlformats.org/drawingml/2006/main">
+              <a:graphicData uri="http://schemas.openxmlformats.org/drawingml/2006/picture">
+                <pic:pic xmlns:pic="http://schemas.openxmlformats.org/drawingml/2006/picture">
+                  <pic:nvPicPr>
+                    <pic:cNvPr id="1" name=""/>
+                    <pic:cNvPicPr/>
+                  </pic:nvPicPr>
+                  <pic:blipFill>
+                    <a:blip r:embed="rId4">
+                      <a:extLst>
+                        <a:ext uri="{28A0092B-C50C-407E-A947-70E740481C1C}">
+                          <a14:useLocalDpi xmlns:a14="http://schemas.microsoft.com/office/drawing/2010/main" val="0"/>
+                        </a:ext>
+                      </a:extLst>
+                    </a:blip>
+                    <a:stretch>
+                      <a:fillRect/>
+                    </a:stretch>
+                  </pic:blipFill>
+                  <pic:spPr>
+                    <a:xfrm>
+                      <a:off x="0" y="0"/>
+                      <a:ext cx="5242560" cy="7139940"/>
+                    </a:xfrm>
+                    <a:prstGeom prst="rect">
+                      <a:avLst/>
+                    </a:prstGeom>
+                  </pic:spPr>
+                </pic:pic>
+              </a:graphicData>
+            </a:graphic>
+            <wp14:sizeRelH relativeFrom="page">
+              <wp14:pctWidth>0</wp14:pctWidth>
+            </wp14:sizeRelH>
+            <wp14:sizeRelV relativeFrom="page">
+              <wp14:pctHeight>0</wp14:pctHeight>
+            </wp14:sizeRelV>
+          </wp:anchor>
+        </w:drawing>
+      </w:r>
+      <w:r>
+        <w:t>mon prix doit être adapter au prix de vente de l’action le jour de la date et ca doit être automatique.</w:t>
       </w:r>
     </w:p>
     <w:sectPr>

</xml_diff>

<commit_message>
Remove redundant compte_id from transaction object
The compte_id field was being duplicated in the transaction object creation. It's already available from compteIdSelectionne elsewhere in the flow, so this redundant assignment has been removed.
</commit_message>
<xml_diff>
--- a/details technique/remarque de choses a ameliorer.docx
+++ b/details technique/remarque de choses a ameliorer.docx
@@ -103,7 +103,35 @@
         </w:drawing>
       </w:r>
       <w:r>
-        <w:t>mon prix doit être adapter au prix de vente de l’action le jour de la date et ca doit être automatique.</w:t>
+        <w:t xml:space="preserve">mon prix doit être adapter au prix de vente de l’action le jour de la date et ca doit être </w:t>
+      </w:r>
+    </w:p>
+    <w:p>
+      <w:pPr>
+        <w:tabs>
+          <w:tab w:val="left" w:pos="2370"/>
+        </w:tabs>
+      </w:pPr>
+    </w:p>
+    <w:p>
+      <w:pPr>
+        <w:tabs>
+          <w:tab w:val="left" w:pos="2370"/>
+        </w:tabs>
+      </w:pPr>
+      <w:r>
+        <w:t>Dans longlet investir le fond et les couelrus définie pour Fondora ne sont pas définis j’ai encore des cadre blanc qui apparaisse.</w:t>
+      </w:r>
+      <w:r>
+        <w:br/>
+      </w:r>
+      <w:r>
+        <w:br/>
+        <w:t xml:space="preserve">Il faut que les comptes pea et cto puisse avoir 0 dessus quand on les créer et appres on peut ajouter largnet desssu en ajoutant des actions  et la valeur du comptes doit évoluer avec les actions et leur </w:t>
+      </w:r>
+      <w:r>
+        <w:lastRenderedPageBreak/>
+        <w:t>valeurs et aussi en comptant les dividendes si on coche un case reinvestir et on reinviestit a chaque date de versements des dividendes.</w:t>
       </w:r>
     </w:p>
     <w:sectPr>

</xml_diff>

<commit_message>
Budget: add widgets, what-if and DB migration
</commit_message>
<xml_diff>
--- a/details technique/remarque de choses a ameliorer.docx
+++ b/details technique/remarque de choses a ameliorer.docx
@@ -2,137 +2,12 @@
 <file path=word/document.xml><?xml version="1.0" encoding="utf-8"?>
 <w:document xmlns:wpc="http://schemas.microsoft.com/office/word/2010/wordprocessingCanvas" xmlns:cx="http://schemas.microsoft.com/office/drawing/2014/chartex" xmlns:cx1="http://schemas.microsoft.com/office/drawing/2015/9/8/chartex" xmlns:cx2="http://schemas.microsoft.com/office/drawing/2015/10/21/chartex" xmlns:cx3="http://schemas.microsoft.com/office/drawing/2016/5/9/chartex" xmlns:cx4="http://schemas.microsoft.com/office/drawing/2016/5/10/chartex" xmlns:cx5="http://schemas.microsoft.com/office/drawing/2016/5/11/chartex" xmlns:cx6="http://schemas.microsoft.com/office/drawing/2016/5/12/chartex" xmlns:cx7="http://schemas.microsoft.com/office/drawing/2016/5/13/chartex" xmlns:cx8="http://schemas.microsoft.com/office/drawing/2016/5/14/chartex" xmlns:mc="http://schemas.openxmlformats.org/markup-compatibility/2006" xmlns:aink="http://schemas.microsoft.com/office/drawing/2016/ink" xmlns:am3d="http://schemas.microsoft.com/office/drawing/2017/model3d" xmlns:o="urn:schemas-microsoft-com:office:office" xmlns:oel="http://schemas.microsoft.com/office/2019/extlst" xmlns:r="http://schemas.openxmlformats.org/officeDocument/2006/relationships" xmlns:m="http://schemas.openxmlformats.org/officeDocument/2006/math" xmlns:v="urn:schemas-microsoft-com:vml" xmlns:wp14="http://schemas.microsoft.com/office/word/2010/wordprocessingDrawing" xmlns:wp="http://schemas.openxmlformats.org/drawingml/2006/wordprocessingDrawing" xmlns:w10="urn:schemas-microsoft-com:office:word" xmlns:w="http://schemas.openxmlformats.org/wordprocessingml/2006/main" xmlns:w14="http://schemas.microsoft.com/office/word/2010/wordml" xmlns:w15="http://schemas.microsoft.com/office/word/2012/wordml" xmlns:w16cex="http://schemas.microsoft.com/office/word/2018/wordml/cex" xmlns:w16cid="http://schemas.microsoft.com/office/word/2016/wordml/cid" xmlns:w16="http://schemas.microsoft.com/office/word/2018/wordml" xmlns:w16sdtdh="http://schemas.microsoft.com/office/word/2020/wordml/sdtdatahash" xmlns:w16se="http://schemas.microsoft.com/office/word/2015/wordml/symex" xmlns:wpg="http://schemas.microsoft.com/office/word/2010/wordprocessingGroup" xmlns:wpi="http://schemas.microsoft.com/office/word/2010/wordprocessingInk" xmlns:wne="http://schemas.microsoft.com/office/word/2006/wordml" xmlns:wps="http://schemas.microsoft.com/office/word/2010/wordprocessingShape" mc:Ignorable="w14 w15 w16se w16cid w16 w16cex w16sdtdh wp14">
   <w:body>
-    <w:p>
-      <w:r>
-        <w:t>On ne voit pas dans linterfaces les differente monaie dans parametre</w:t>
-      </w:r>
-      <w:r>
-        <w:br/>
-        <w:t>de plus la typographie n’est pas msies en place partout, longlet investissement semble avoir été oublier.</w:t>
-      </w:r>
-      <w:r>
-        <w:t xml:space="preserve"> Les ecritrures blanche sur blanc dans les menue deroulant font qu’on ne  voit rien.</w:t>
-      </w:r>
-    </w:p>
-    <w:p>
-      <w:r>
-        <w:br/>
-        <w:t>Dans longlet budget il faudrait que tous les graphiques et panneau de linterfaces soit optionable et qu’on choissis les quelles mettre donc rajouter les choses qui ne le sont pas dans personlaiser les graphiques.</w:t>
-      </w:r>
-      <w:r>
-        <w:br/>
-        <w:t xml:space="preserve">on a un gaphiques  et si jepargnais mais on peut rien régler dedans et il est pas relier a lobjectif deparnge il faut relger ca le graphiqeus restant a vivre n’a aucune donner il sert a iren il faut le releir au donner. </w:t>
-      </w:r>
-      <w:r>
-        <w:br/>
-        <w:t>on ne peut pas supprimer une depense ou un revneu recurent ca beugue il faut que ca soit possible et que ces depens soit bien prises en comptes tous le temps dans otus les graphiques sur les dépenses et sur les comptes au quelle elles sont afilier mais il faut aussi que ces donner de dépenses soit valider ou non par les relever bancaire importer et que si elle sont valider il n’y ai pas de doublon. Si tu comprends pas poses moi des questions.</w:t>
-      </w:r>
-      <w:r>
-        <w:br/>
-      </w:r>
-      <w:r>
-        <w:br/>
-      </w:r>
-      <w:r>
-        <w:lastRenderedPageBreak/>
-        <w:br/>
-      </w:r>
-      <w:r>
-        <w:drawing>
-          <wp:anchor distT="0" distB="0" distL="114300" distR="114300" simplePos="0" relativeHeight="251658240" behindDoc="1" locked="0" layoutInCell="1" allowOverlap="1" wp14:anchorId="714170AA" wp14:editId="7290AF2B">
-            <wp:simplePos x="0" y="0"/>
-            <wp:positionH relativeFrom="column">
-              <wp:posOffset>1905</wp:posOffset>
-            </wp:positionH>
-            <wp:positionV relativeFrom="paragraph">
-              <wp:posOffset>186055</wp:posOffset>
-            </wp:positionV>
-            <wp:extent cx="5242560" cy="7139940"/>
-            <wp:effectExtent l="0" t="0" r="0" b="3810"/>
-            <wp:wrapTight wrapText="bothSides">
-              <wp:wrapPolygon edited="0">
-                <wp:start x="0" y="0"/>
-                <wp:lineTo x="0" y="21554"/>
-                <wp:lineTo x="21506" y="21554"/>
-                <wp:lineTo x="21506" y="0"/>
-                <wp:lineTo x="0" y="0"/>
-              </wp:wrapPolygon>
-            </wp:wrapTight>
-            <wp:docPr id="1" name="Image 1"/>
-            <wp:cNvGraphicFramePr>
-              <a:graphicFrameLocks xmlns:a="http://schemas.openxmlformats.org/drawingml/2006/main" noChangeAspect="1"/>
-            </wp:cNvGraphicFramePr>
-            <a:graphic xmlns:a="http://schemas.openxmlformats.org/drawingml/2006/main">
-              <a:graphicData uri="http://schemas.openxmlformats.org/drawingml/2006/picture">
-                <pic:pic xmlns:pic="http://schemas.openxmlformats.org/drawingml/2006/picture">
-                  <pic:nvPicPr>
-                    <pic:cNvPr id="1" name=""/>
-                    <pic:cNvPicPr/>
-                  </pic:nvPicPr>
-                  <pic:blipFill>
-                    <a:blip r:embed="rId4">
-                      <a:extLst>
-                        <a:ext uri="{28A0092B-C50C-407E-A947-70E740481C1C}">
-                          <a14:useLocalDpi xmlns:a14="http://schemas.microsoft.com/office/drawing/2010/main" val="0"/>
-                        </a:ext>
-                      </a:extLst>
-                    </a:blip>
-                    <a:stretch>
-                      <a:fillRect/>
-                    </a:stretch>
-                  </pic:blipFill>
-                  <pic:spPr>
-                    <a:xfrm>
-                      <a:off x="0" y="0"/>
-                      <a:ext cx="5242560" cy="7139940"/>
-                    </a:xfrm>
-                    <a:prstGeom prst="rect">
-                      <a:avLst/>
-                    </a:prstGeom>
-                  </pic:spPr>
-                </pic:pic>
-              </a:graphicData>
-            </a:graphic>
-            <wp14:sizeRelH relativeFrom="page">
-              <wp14:pctWidth>0</wp14:pctWidth>
-            </wp14:sizeRelH>
-            <wp14:sizeRelV relativeFrom="page">
-              <wp14:pctHeight>0</wp14:pctHeight>
-            </wp14:sizeRelV>
-          </wp:anchor>
-        </w:drawing>
-      </w:r>
-      <w:r>
-        <w:t xml:space="preserve">mon prix doit être adapter au prix de vente de l’action le jour de la date et ca doit être </w:t>
-      </w:r>
-    </w:p>
     <w:p>
       <w:pPr>
         <w:tabs>
           <w:tab w:val="left" w:pos="2370"/>
         </w:tabs>
       </w:pPr>
-    </w:p>
-    <w:p>
-      <w:pPr>
-        <w:tabs>
-          <w:tab w:val="left" w:pos="2370"/>
-        </w:tabs>
-      </w:pPr>
-      <w:r>
-        <w:t>Dans longlet investir le fond et les couelrus définie pour Fondora ne sont pas définis j’ai encore des cadre blanc qui apparaisse.</w:t>
-      </w:r>
-      <w:r>
-        <w:br/>
-      </w:r>
-      <w:r>
-        <w:br/>
-        <w:t xml:space="preserve">Il faut que les comptes pea et cto puisse avoir 0 dessus quand on les créer et appres on peut ajouter largnet desssu en ajoutant des actions  et la valeur du comptes doit évoluer avec les actions et leur </w:t>
-      </w:r>
-      <w:r>
-        <w:lastRenderedPageBreak/>
-        <w:t>valeurs et aussi en comptant les dividendes si on coche un case reinvestir et on reinviestit a chaque date de versements des dividendes.</w:t>
-      </w:r>
     </w:p>
     <w:sectPr>
       <w:pgSz w:w="11906" w:h="16838"/>

</xml_diff>